<commit_message>
Last of today's changes
</commit_message>
<xml_diff>
--- a/_posts/EarlyAlpha.docx
+++ b/_posts/EarlyAlpha.docx
@@ -1283,15 +1283,7 @@
         <w:rPr>
           <w:rFonts w:ascii="Courier New" w:hAnsi="Courier New" w:cs="Courier New"/>
         </w:rPr>
-        <w:t>***It explains the weird, peculiar and downright bad ways in which p</w:t>
-      </w:r>
-      <w:bookmarkStart w:id="0" w:name="_GoBack"/>
-      <w:bookmarkEnd w:id="0"/>
-      <w:r>
-        <w:rPr>
-          <w:rFonts w:ascii="Courier New" w:hAnsi="Courier New" w:cs="Courier New"/>
-        </w:rPr>
-        <w:t xml:space="preserve">eople involved in projects behave without having to call them names or thing that they're bad </w:t>
+        <w:t xml:space="preserve">***It explains the weird, peculiar and downright bad ways in which people involved in projects behave without having to call them names or thing that they're bad </w:t>
       </w:r>
       <w:proofErr w:type="gramStart"/>
       <w:r>
@@ -11175,6 +11167,344 @@
           <w:rFonts w:ascii="Courier New" w:hAnsi="Courier New" w:cs="Courier New"/>
         </w:rPr>
       </w:pPr>
+    </w:p>
+    <w:p>
+      <w:pPr>
+        <w:pStyle w:val="Heading2"/>
+        <w:rPr>
+          <w:rFonts w:ascii="Courier New" w:hAnsi="Courier New" w:cs="Courier New"/>
+        </w:rPr>
+      </w:pPr>
+      <w:r>
+        <w:rPr>
+          <w:rFonts w:ascii="Courier New" w:hAnsi="Courier New" w:cs="Courier New"/>
+        </w:rPr>
+        <w:t>A Reading List for Delivering the Impossible</w:t>
+      </w:r>
+    </w:p>
+    <w:p>
+      <w:pPr>
+        <w:pStyle w:val="PlainText"/>
+        <w:rPr>
+          <w:rFonts w:ascii="Courier New" w:hAnsi="Courier New" w:cs="Courier New"/>
+        </w:rPr>
+      </w:pPr>
+    </w:p>
+    <w:p>
+      <w:pPr>
+        <w:pStyle w:val="PlainText"/>
+        <w:rPr>
+          <w:rFonts w:ascii="Courier New" w:hAnsi="Courier New" w:cs="Courier New"/>
+        </w:rPr>
+      </w:pPr>
+      <w:r>
+        <w:rPr>
+          <w:rFonts w:ascii="Courier New" w:hAnsi="Courier New" w:cs="Courier New"/>
+        </w:rPr>
+        <w:t xml:space="preserve">What would be on it? The book on John Boyd. The Toyota </w:t>
+      </w:r>
+      <w:bookmarkStart w:id="0" w:name="_GoBack"/>
+      <w:bookmarkEnd w:id="0"/>
+      <w:r>
+        <w:rPr>
+          <w:rFonts w:ascii="Courier New" w:hAnsi="Courier New" w:cs="Courier New"/>
+        </w:rPr>
+        <w:t xml:space="preserve">production system. Scrum and XP from the trenches.  The first two of those are books that I've read several times. The other book that I want to recommend is thinking fast and slow, which I've read *some* of. And I'm thinking if I'm going to recommend books, they should be ones that I've read. What else have I read, </w:t>
+      </w:r>
+      <w:proofErr w:type="gramStart"/>
+      <w:r>
+        <w:rPr>
+          <w:rFonts w:ascii="Courier New" w:hAnsi="Courier New" w:cs="Courier New"/>
+        </w:rPr>
+        <w:t>actually the</w:t>
+      </w:r>
+      <w:proofErr w:type="gramEnd"/>
+      <w:r>
+        <w:rPr>
+          <w:rFonts w:ascii="Courier New" w:hAnsi="Courier New" w:cs="Courier New"/>
+        </w:rPr>
+        <w:t xml:space="preserve"> </w:t>
+      </w:r>
+      <w:proofErr w:type="spellStart"/>
+      <w:r>
+        <w:rPr>
+          <w:rFonts w:ascii="Courier New" w:hAnsi="Courier New" w:cs="Courier New"/>
+        </w:rPr>
+        <w:t>devops</w:t>
+      </w:r>
+      <w:proofErr w:type="spellEnd"/>
+      <w:r>
+        <w:rPr>
+          <w:rFonts w:ascii="Courier New" w:hAnsi="Courier New" w:cs="Courier New"/>
+        </w:rPr>
+        <w:t xml:space="preserve"> handbook. If you're doing software development I suppose, Extreme programming explained. And then actually, that book on emotional management.</w:t>
+      </w:r>
+    </w:p>
+    <w:p>
+      <w:pPr>
+        <w:pStyle w:val="PlainText"/>
+        <w:rPr>
+          <w:rFonts w:ascii="Courier New" w:hAnsi="Courier New" w:cs="Courier New"/>
+        </w:rPr>
+      </w:pPr>
+    </w:p>
+    <w:p>
+      <w:pPr>
+        <w:pStyle w:val="PlainText"/>
+        <w:rPr>
+          <w:rFonts w:ascii="Courier New" w:hAnsi="Courier New" w:cs="Courier New"/>
+        </w:rPr>
+      </w:pPr>
+      <w:r>
+        <w:rPr>
+          <w:rFonts w:ascii="Courier New" w:hAnsi="Courier New" w:cs="Courier New"/>
+        </w:rPr>
+        <w:t xml:space="preserve">I was very taken by that blog post that </w:t>
+      </w:r>
+      <w:proofErr w:type="gramStart"/>
+      <w:r>
+        <w:rPr>
+          <w:rFonts w:ascii="Courier New" w:hAnsi="Courier New" w:cs="Courier New"/>
+        </w:rPr>
+        <w:t>said</w:t>
+      </w:r>
+      <w:proofErr w:type="gramEnd"/>
+      <w:r>
+        <w:rPr>
+          <w:rFonts w:ascii="Courier New" w:hAnsi="Courier New" w:cs="Courier New"/>
+        </w:rPr>
+        <w:t xml:space="preserve"> "I read all of these business books so you don't have to."</w:t>
+      </w:r>
+    </w:p>
+    <w:p>
+      <w:pPr>
+        <w:pStyle w:val="PlainText"/>
+        <w:rPr>
+          <w:rFonts w:ascii="Courier New" w:hAnsi="Courier New" w:cs="Courier New"/>
+        </w:rPr>
+      </w:pPr>
+    </w:p>
+    <w:p>
+      <w:pPr>
+        <w:pStyle w:val="PlainText"/>
+        <w:rPr>
+          <w:rFonts w:ascii="Courier New" w:hAnsi="Courier New" w:cs="Courier New"/>
+        </w:rPr>
+      </w:pPr>
+      <w:r>
+        <w:rPr>
+          <w:rFonts w:ascii="Courier New" w:hAnsi="Courier New" w:cs="Courier New"/>
+        </w:rPr>
+        <w:t xml:space="preserve">Because if you did that for these books what would it be.                                                                                                                   </w:t>
+      </w:r>
+    </w:p>
+    <w:p>
+      <w:pPr>
+        <w:pStyle w:val="PlainText"/>
+        <w:rPr>
+          <w:rFonts w:ascii="Courier New" w:hAnsi="Courier New" w:cs="Courier New"/>
+        </w:rPr>
+      </w:pPr>
+      <w:r>
+        <w:rPr>
+          <w:rFonts w:ascii="Courier New" w:hAnsi="Courier New" w:cs="Courier New"/>
+        </w:rPr>
+        <w:t>Boyd - "Observe, Orient, Decide, Act" basically, you want to be more manoeuvrable than your enemy, you want to build a better model of the terrain.</w:t>
+      </w:r>
+    </w:p>
+    <w:p>
+      <w:pPr>
+        <w:pStyle w:val="PlainText"/>
+        <w:rPr>
+          <w:rFonts w:ascii="Courier New" w:hAnsi="Courier New" w:cs="Courier New"/>
+        </w:rPr>
+      </w:pPr>
+      <w:r>
+        <w:rPr>
+          <w:rFonts w:ascii="Courier New" w:hAnsi="Courier New" w:cs="Courier New"/>
+        </w:rPr>
+        <w:t xml:space="preserve">                                                                                                                                                                            Ohno - "What is it?" What are you *doing* what business are you *in*? If you don't know, you're at high risk of going out of business.</w:t>
+      </w:r>
+    </w:p>
+    <w:p>
+      <w:pPr>
+        <w:pStyle w:val="PlainText"/>
+        <w:rPr>
+          <w:rFonts w:ascii="Courier New" w:hAnsi="Courier New" w:cs="Courier New"/>
+        </w:rPr>
+      </w:pPr>
+    </w:p>
+    <w:p>
+      <w:pPr>
+        <w:pStyle w:val="PlainText"/>
+        <w:rPr>
+          <w:rFonts w:ascii="Courier New" w:hAnsi="Courier New" w:cs="Courier New"/>
+        </w:rPr>
+      </w:pPr>
+      <w:r>
+        <w:rPr>
+          <w:rFonts w:ascii="Courier New" w:hAnsi="Courier New" w:cs="Courier New"/>
+        </w:rPr>
+        <w:t>Kahneman - the inside view tells you what might happen in a near perfect situation - the outside view tells you what will most likely happen.</w:t>
+      </w:r>
+    </w:p>
+    <w:p>
+      <w:pPr>
+        <w:pStyle w:val="PlainText"/>
+        <w:rPr>
+          <w:rFonts w:ascii="Courier New" w:hAnsi="Courier New" w:cs="Courier New"/>
+        </w:rPr>
+      </w:pPr>
+    </w:p>
+    <w:p>
+      <w:pPr>
+        <w:pStyle w:val="PlainText"/>
+        <w:rPr>
+          <w:rFonts w:ascii="Courier New" w:hAnsi="Courier New" w:cs="Courier New"/>
+        </w:rPr>
+      </w:pPr>
+      <w:r>
+        <w:rPr>
+          <w:rFonts w:ascii="Courier New" w:hAnsi="Courier New" w:cs="Courier New"/>
+        </w:rPr>
+        <w:t>Emotional Labour Lady - There will always be work being calm and pleasant in situations where people are being upset and unpleasant. There will also always be work being unpleasant in situations where they want you to be nice (e.g. where they owe you money).</w:t>
+      </w:r>
+    </w:p>
+    <w:p>
+      <w:pPr>
+        <w:pStyle w:val="PlainText"/>
+        <w:rPr>
+          <w:rFonts w:ascii="Courier New" w:hAnsi="Courier New" w:cs="Courier New"/>
+        </w:rPr>
+      </w:pPr>
+    </w:p>
+    <w:p>
+      <w:pPr>
+        <w:pStyle w:val="PlainText"/>
+        <w:rPr>
+          <w:rFonts w:ascii="Courier New" w:hAnsi="Courier New" w:cs="Courier New"/>
+        </w:rPr>
+      </w:pPr>
+      <w:proofErr w:type="spellStart"/>
+      <w:r>
+        <w:rPr>
+          <w:rFonts w:ascii="Courier New" w:hAnsi="Courier New" w:cs="Courier New"/>
+        </w:rPr>
+        <w:t>Hirschmann</w:t>
+      </w:r>
+      <w:proofErr w:type="spellEnd"/>
+      <w:r>
+        <w:rPr>
+          <w:rFonts w:ascii="Courier New" w:hAnsi="Courier New" w:cs="Courier New"/>
+        </w:rPr>
+        <w:t xml:space="preserve"> (via Malcolm Gladwell) - The Fata Morgana and the Hiding hand.</w:t>
+      </w:r>
+    </w:p>
+    <w:p>
+      <w:pPr>
+        <w:pStyle w:val="PlainText"/>
+        <w:rPr>
+          <w:rFonts w:ascii="Courier New" w:hAnsi="Courier New" w:cs="Courier New"/>
+        </w:rPr>
+      </w:pPr>
+      <w:r>
+        <w:rPr>
+          <w:rFonts w:ascii="Courier New" w:hAnsi="Courier New" w:cs="Courier New"/>
+        </w:rPr>
+        <w:t xml:space="preserve">                                                                                                                                                                            Ignacio Matt Blanco - The unconscious is </w:t>
+      </w:r>
+      <w:proofErr w:type="spellStart"/>
+      <w:r>
+        <w:rPr>
+          <w:rFonts w:ascii="Courier New" w:hAnsi="Courier New" w:cs="Courier New"/>
+        </w:rPr>
+        <w:t>atemporal</w:t>
+      </w:r>
+      <w:proofErr w:type="spellEnd"/>
+      <w:r>
+        <w:rPr>
+          <w:rFonts w:ascii="Courier New" w:hAnsi="Courier New" w:cs="Courier New"/>
+        </w:rPr>
+        <w:t xml:space="preserve"> and symmetrical, the conscious is temporal and asymmetrical - dreams are </w:t>
+      </w:r>
+      <w:proofErr w:type="spellStart"/>
+      <w:r>
+        <w:rPr>
+          <w:rFonts w:ascii="Courier New" w:hAnsi="Courier New" w:cs="Courier New"/>
+        </w:rPr>
+        <w:t>atemporal</w:t>
+      </w:r>
+      <w:proofErr w:type="spellEnd"/>
+      <w:r>
+        <w:rPr>
+          <w:rFonts w:ascii="Courier New" w:hAnsi="Courier New" w:cs="Courier New"/>
+        </w:rPr>
+        <w:t xml:space="preserve"> and symmetrical project delivery is temporal and asymmetrical.</w:t>
+      </w:r>
+    </w:p>
+    <w:p>
+      <w:pPr>
+        <w:pStyle w:val="PlainText"/>
+        <w:rPr>
+          <w:rFonts w:ascii="Courier New" w:hAnsi="Courier New" w:cs="Courier New"/>
+        </w:rPr>
+      </w:pPr>
+      <w:r>
+        <w:rPr>
+          <w:rFonts w:ascii="Courier New" w:hAnsi="Courier New" w:cs="Courier New"/>
+        </w:rPr>
+        <w:t xml:space="preserve">                                                                                                                                                                            Louis </w:t>
+      </w:r>
+      <w:proofErr w:type="spellStart"/>
+      <w:r>
+        <w:rPr>
+          <w:rFonts w:ascii="Courier New" w:hAnsi="Courier New" w:cs="Courier New"/>
+        </w:rPr>
+        <w:t>Althuser</w:t>
+      </w:r>
+      <w:proofErr w:type="spellEnd"/>
+      <w:r>
+        <w:rPr>
+          <w:rFonts w:ascii="Courier New" w:hAnsi="Courier New" w:cs="Courier New"/>
+        </w:rPr>
+        <w:t xml:space="preserve"> (</w:t>
+      </w:r>
+      <w:proofErr w:type="spellStart"/>
+      <w:r>
+        <w:rPr>
+          <w:rFonts w:ascii="Courier New" w:hAnsi="Courier New" w:cs="Courier New"/>
+        </w:rPr>
+        <w:t>Triz</w:t>
+      </w:r>
+      <w:proofErr w:type="spellEnd"/>
+      <w:r>
+        <w:rPr>
+          <w:rFonts w:ascii="Courier New" w:hAnsi="Courier New" w:cs="Courier New"/>
+        </w:rPr>
+        <w:t>) - invention is about identifying and managing contradictions.</w:t>
+      </w:r>
+    </w:p>
+    <w:p>
+      <w:pPr>
+        <w:pStyle w:val="PlainText"/>
+        <w:rPr>
+          <w:rFonts w:ascii="Courier New" w:hAnsi="Courier New" w:cs="Courier New"/>
+        </w:rPr>
+      </w:pPr>
+    </w:p>
+    <w:p>
+      <w:pPr>
+        <w:pStyle w:val="PlainText"/>
+        <w:rPr>
+          <w:rFonts w:ascii="Courier New" w:hAnsi="Courier New" w:cs="Courier New"/>
+        </w:rPr>
+      </w:pPr>
+      <w:r>
+        <w:rPr>
+          <w:rFonts w:ascii="Courier New" w:hAnsi="Courier New" w:cs="Courier New"/>
+        </w:rPr>
+        <w:t>Keith Johnstone - Impro and Impro For Storytellers</w:t>
+      </w:r>
     </w:p>
     <w:sectPr>
       <w:pgSz w:w="11906" w:h="16838"/>

</xml_diff>